<commit_message>
feat(pancasila): add Kebaya definition, philosophy, and types to student notes and teacher script
</commit_message>
<xml_diff>
--- a/docs/Pancasila_Konten_Canva_Sesi2_Mishka_Kelas5.docx
+++ b/docs/Pancasila_Konten_Canva_Sesi2_Mishka_Kelas5.docx
@@ -884,21 +884,24 @@
             <w:pPr>
               <w:spacing w:line="276" w:lineRule="auto"/>
             </w:pPr>
+            <w:r/>
             <w:r>
               <w:rPr>
                 <w:rFonts w:ascii="Calibri" w:hAnsi="Calibri"/>
                 <w:b/>
-                <w:color w:val="0D9488"/>
+                <w:i w:val="0"/>
+                <w:color w:val="9F1239"/>
                 <w:sz w:val="22"/>
               </w:rPr>
-              <w:t>SLIDE 8: TEXTBOOK: WARISAN PAKAIAN ADAT, SENJATA &amp; ALAT MUSIK TRADISIONAL</w:t>
+              <w:t>SLIDE 8: TEXTBOOK: WARISAN BUSANA ADAT KEBAYA, WASTRA &amp; ALAT MUSIK TRADISIONAL</w:t>
               <w:br/>
             </w:r>
             <w:r>
               <w:rPr>
                 <w:rFonts w:ascii="Calibri" w:hAnsi="Calibri"/>
                 <w:b/>
-                <w:color w:val="4338CA"/>
+                <w:i w:val="0"/>
+                <w:color w:val="0284C7"/>
                 <w:sz w:val="19"/>
               </w:rPr>
               <w:t>[📚 KONSEP TEXTBOOK KEMENDIKBUD]</w:t>
@@ -907,58 +910,145 @@
             <w:r>
               <w:rPr>
                 <w:rFonts w:ascii="Calibri" w:hAnsi="Calibri"/>
-                <w:i/>
-                <w:color w:val="64748B"/>
+                <w:b/>
+                <w:i w:val="0"/>
                 <w:sz w:val="19"/>
               </w:rPr>
-              <w:t>🎨 Visual Cue Canva: Kolase 4 alat musik daerah: Angklung (Jawa Barat), Sasando (NTT), Gamelan (Jawa/Bali), dan Tifa (Papua/Maluku).</w:t>
+              <w:t xml:space="preserve">🎨 Visual Cue Canva: </w:t>
+            </w:r>
+            <w:r>
+              <w:rPr>
+                <w:rFonts w:ascii="Calibri" w:hAnsi="Calibri"/>
+                <w:b w:val="0"/>
+                <w:i w:val="0"/>
+                <w:sz w:val="19"/>
+              </w:rPr>
+              <w:t>Kolase 4 alat musik daerah (Sasando NTT, Angklung Jawa Barat, Tifa Papua, Gamelan Jawa) berpadu dengan wastra batik/tenun dan keanggunan busana Kebaya Indonesia (Kebaya Kartini, Kebaya Encim Betawi, dan Kebaya Bali).</w:t>
               <w:br/>
             </w:r>
             <w:r>
               <w:rPr>
                 <w:rFonts w:ascii="Calibri" w:hAnsi="Calibri"/>
                 <w:b/>
-                <w:color w:val="1E293B"/>
+                <w:i w:val="0"/>
                 <w:sz w:val="19"/>
               </w:rPr>
-              <w:t>🎙️ Narasi Guru ke Siswa: "Tahukah kamu alat musik Sasando terbuat dari daun apa? Mengapa petikan dawainya bisa menghasilkan melodi yang begitu syahdu?"</w:t>
+              <w:t xml:space="preserve">🎙️ Narasi Guru ke Siswa: </w:t>
+            </w:r>
+            <w:r>
+              <w:rPr>
+                <w:rFonts w:ascii="Calibri" w:hAnsi="Calibri"/>
+                <w:b w:val="0"/>
+                <w:i/>
+                <w:sz w:val="19"/>
+              </w:rPr>
+              <w:t>"Mishka, tahukah kamu mengapa potongan kebaya dan lilitan kain batik di bawahnya membuat langkah perempuan Indonesia begitu tenang dan anggun? Bagaimana kebaya kini diakui sebagai warisan dunia oleh UNESCO?"</w:t>
               <w:br/>
               <w:br/>
             </w:r>
             <w:r>
               <w:rPr>
                 <w:rFonts w:ascii="Calibri" w:hAnsi="Calibri"/>
-                <w:color w:val="334155"/>
+                <w:b/>
+                <w:i w:val="0"/>
                 <w:sz w:val="19"/>
               </w:rPr>
-              <w:t xml:space="preserve">  • Buku Siswa Kemendikbud Hal 105-112: Warisan Mahakarya Takbenda:</w:t>
+              <w:t xml:space="preserve">  • Buku Siswa Kemendikbud Hal 105-112: Warisan Mahakarya Takbenda Nusantara:</w:t>
               <w:br/>
             </w:r>
             <w:r>
               <w:rPr>
                 <w:rFonts w:ascii="Calibri" w:hAnsi="Calibri"/>
-                <w:color w:val="334155"/>
+                <w:b/>
+                <w:i w:val="0"/>
                 <w:sz w:val="19"/>
               </w:rPr>
-              <w:t xml:space="preserve">  •   • Alat Musik Bernada: Angklung dari bambu yang diakui UNESCO, Sasando dari daun lontar pulau Rote, Tifa gendang khas timur.</w:t>
+              <w:t xml:space="preserve">  •   • Pengertian &amp; Filosofi Kebaya: </w:t>
+            </w:r>
+            <w:r>
+              <w:rPr>
+                <w:rFonts w:ascii="Calibri" w:hAnsi="Calibri"/>
+                <w:b w:val="0"/>
+                <w:i w:val="0"/>
+                <w:sz w:val="19"/>
+              </w:rPr>
+              <w:t>Busana atasan tradisional perempuan Indonesia berlengan panjang yang dipadukan kain jarik batik/songket. Melambangkan keanggunan, kelemahlembutan, kesopanan (unggah-ungguh), dan ketegasan martabat perempuan Indonesia. Langkah teratur berkebaya mencerminkan ketenangan dan kebijaksanaan budi pekerti.</w:t>
               <w:br/>
             </w:r>
             <w:r>
               <w:rPr>
                 <w:rFonts w:ascii="Calibri" w:hAnsi="Calibri"/>
-                <w:color w:val="334155"/>
+                <w:b/>
+                <w:i w:val="0"/>
                 <w:sz w:val="19"/>
               </w:rPr>
-              <w:t xml:space="preserve">  •   • Pakaian Adat &amp; Kain Tradisional: Batik, Songket, Ulos, dan Tenun Ikat yang memiliki filosofi doa dan martabat luhur.</w:t>
+              <w:t xml:space="preserve">  •   • Ragam Jenis Kebaya Populer: </w:t>
+            </w:r>
+            <w:r>
+              <w:rPr>
+                <w:rFonts w:ascii="Calibri" w:hAnsi="Calibri"/>
+                <w:b w:val="0"/>
+                <w:i w:val="0"/>
+                <w:sz w:val="19"/>
+              </w:rPr>
+              <w:t>Kebaya Kartini &amp; Kutu Baru (Jawa - bersahaja), Kebaya Encim (Betawi - bordir bunga cerah akulturasi Nusantara-Tionghoa), dan Kebaya Bali (selendang pinggang lambang pengendalian diri). Diajukan bersama ke UNESCO sebagai Warisan Budaya Takbenda Dunia.</w:t>
               <w:br/>
             </w:r>
             <w:r>
               <w:rPr>
                 <w:rFonts w:ascii="Calibri" w:hAnsi="Calibri"/>
-                <w:color w:val="334155"/>
+                <w:b/>
+                <w:i w:val="0"/>
                 <w:sz w:val="19"/>
               </w:rPr>
-              <w:t xml:space="preserve">  •   • Senjata Tradisional: Keris, Rencong, Mandau, dan Badik sebagai lambang kehormatan dan pertahanan diri ksatria masa lalu.</w:t>
+              <w:t xml:space="preserve">  •   • Alat Musik Bernada: </w:t>
+            </w:r>
+            <w:r>
+              <w:rPr>
+                <w:rFonts w:ascii="Calibri" w:hAnsi="Calibri"/>
+                <w:b w:val="0"/>
+                <w:i w:val="0"/>
+                <w:sz w:val="19"/>
+              </w:rPr>
+              <w:t>Angklung dari bambu (UNESCO), Sasando dari daun lontar pulau Rote, Tifa gendang kayu kulit biawak khas timur, dan Gamelan ageng Jawa/Bali.</w:t>
+              <w:br/>
+            </w:r>
+            <w:r>
+              <w:rPr>
+                <w:rFonts w:ascii="Calibri" w:hAnsi="Calibri"/>
+                <w:b/>
+                <w:i w:val="0"/>
+                <w:sz w:val="19"/>
+              </w:rPr>
+              <w:t xml:space="preserve">  •   • Wastra &amp; Kain Tradisional: </w:t>
+            </w:r>
+            <w:r>
+              <w:rPr>
+                <w:rFonts w:ascii="Calibri" w:hAnsi="Calibri"/>
+                <w:b w:val="0"/>
+                <w:i w:val="0"/>
+                <w:sz w:val="19"/>
+              </w:rPr>
+              <w:t>Batik, Songket Minangkabau/Palembang, Ulos Batak, dan Tenun Ikat NTT yang sarat filosofi doa leluhur.</w:t>
+              <w:br/>
+            </w:r>
+            <w:r>
+              <w:rPr>
+                <w:rFonts w:ascii="Calibri" w:hAnsi="Calibri"/>
+                <w:b/>
+                <w:i w:val="0"/>
+                <w:sz w:val="19"/>
+              </w:rPr>
+              <w:t xml:space="preserve">  •   • Senjata Tradisional: </w:t>
+            </w:r>
+            <w:r>
+              <w:rPr>
+                <w:rFonts w:ascii="Calibri" w:hAnsi="Calibri"/>
+                <w:b w:val="0"/>
+                <w:i w:val="0"/>
+                <w:sz w:val="19"/>
+              </w:rPr>
+              <w:t>Keris (Jawa), Rencong (Aceh), Mandau (Kalimantan), dan Badik (Sulawesi) sebagai lambang kehormatan dan pertahanan diri ksatria masa lalu.</w:t>
               <w:br/>
             </w:r>
           </w:p>

</xml_diff>